<commit_message>
docs(practice): correct ChamBucket team details
</commit_message>
<xml_diff>
--- a/docs/practice-report/teamnova-summer-practice-report.docx
+++ b/docs/practice-report/teamnova-summer-practice-report.docx
@@ -2,8 +2,6 @@
 <file path=word/document.xml><?xml version="1.0" encoding="utf-8"?>
 <w:document xmlns:wpc="http://schemas.microsoft.com/office/word/2010/wordprocessingCanvas" xmlns:mo="http://schemas.microsoft.com/office/mac/office/2008/main" xmlns:mc="http://schemas.openxmlformats.org/markup-compatibility/2006" xmlns:mv="urn:schemas-microsoft-com:mac:vml" xmlns:o="urn:schemas-microsoft-com:office:office" xmlns:r="http://schemas.openxmlformats.org/officeDocument/2006/relationships" xmlns:m="http://schemas.openxmlformats.org/officeDocument/2006/math" xmlns:v="urn:schemas-microsoft-com:vml" xmlns:wp14="http://schemas.microsoft.com/office/word/2010/wordprocessingDrawing" xmlns:wp="http://schemas.openxmlformats.org/drawingml/2006/wordprocessingDrawing" xmlns:w10="urn:schemas-microsoft-com:office:word" xmlns:w="http://schemas.openxmlformats.org/wordprocessingml/2006/main" xmlns:w14="http://schemas.microsoft.com/office/word/2010/wordml" xmlns:wpg="http://schemas.microsoft.com/office/word/2010/wordprocessingGroup" xmlns:wpi="http://schemas.microsoft.com/office/word/2010/wordprocessingInk" xmlns:wne="http://schemas.microsoft.com/office/word/2006/wordml" xmlns:wps="http://schemas.microsoft.com/office/word/2010/wordprocessingShape" mc:Ignorable="w14 wp14">
   <w:body>
-    <w:p/>
-    <w:p/>
     <w:p/>
     <w:p/>
     <w:p>
@@ -67,6 +65,8 @@
         <w:t>Разработка функции подбора участников</w:t>
         <w:br/>
         <w:t>по требованиям проекта в веб-платформе Teamnova</w:t>
+        <w:br/>
+        <w:t>Команда ChamBucket</w:t>
       </w:r>
     </w:p>
     <w:p>
@@ -348,7 +348,7 @@
     </w:p>
     <w:p>
       <w:r>
-        <w:t>Летняя проектная практика направлена на закрепление знаний первого курса и получение опыта командной разработки прикладной информационной системы. Объект практики — веб-платформа Teamnova для формирования проектных команд в сфере информационных технологий. Она объединяет владельцев проектов и специалистов, которые ищут практические задачи по своим навыкам.</w:t>
+        <w:t>Летняя проектная практика является продолжением проекта Teamnova, начатого командой ChamBucket в рамках проектного практикума. Новый проект с нуля не создавался, сторонний или заброшенный продукт не использовался: работа выполнялась в существующем репозитории и развивала уже реализованный MVP. Teamnova — веб-платформа для формирования проектных IT-команд.</w:t>
       </w:r>
     </w:p>
     <w:p>
@@ -381,12 +381,12 @@
     </w:p>
     <w:p>
       <w:r>
-        <w:t>Teamnova — full-stack веб-приложение для поиска IT-проектов, специалистов и формирования команд. Центральными сущностями являются пользователь, профиль, навык, проект и заявка. Владелец описывает идею, технологический стек и требуемые роли. Участник заполняет профиль и использует поиск, после чего может отправить заявку. Принятый кандидат отображается в составе команды проекта.</w:t>
+        <w:t>Teamnova — full-stack веб-приложение для поиска IT-проектов, специалистов и формирования команд. Центральными сущностями являются пользователь, профиль, навык, проект и заявка. В рамках летней практики команда ChamBucket продолжает разработку того же проекта после проектного практикума: сохраняются существующая кодовая база, архитектура и пользовательские сценарии, а MVP расширяется отдельной frontend-функцией.</w:t>
       </w:r>
     </w:p>
     <w:p>
       <w:r>
-        <w:t>Проект реализуется командой с разделением ответственности. Матрица ниже составлена по актуальной документации репозитория. В данной итерации изменения сосредоточены в зоне frontend-разработки; серверные контракты, база данных и инфраструктура используются как готовые границы системы.</w:t>
+        <w:t>Актуальный состав ChamBucket включает frontend-разработчика, backend-разработчика и аналитика. В данной итерации изменения сосредоточены в индивидуальной frontend-зоне Матвея Мусиенко; готовые серверные контракты и согласованные требования используются как границы реализации.</w:t>
       </w:r>
     </w:p>
     <w:p>
@@ -394,7 +394,7 @@
         <w:pStyle w:val="Caption"/>
       </w:pPr>
       <w:r>
-        <w:t>Таблица 1 — Матрица ответственности команды Teamnova</w:t>
+        <w:t>Таблица 1 — Матрица ответственности команды ChamBucket</w:t>
       </w:r>
     </w:p>
     <w:tbl>
@@ -406,10 +406,10 @@
         <w:tblInd w:w="120" w:type="dxa"/>
       </w:tblPr>
       <w:tblGrid>
-        <w:gridCol w:w="1750"/>
-        <w:gridCol w:w="1700"/>
-        <w:gridCol w:w="3550"/>
-        <w:gridCol w:w="2360"/>
+        <w:gridCol w:w="2300"/>
+        <w:gridCol w:w="1800"/>
+        <w:gridCol w:w="3000"/>
+        <w:gridCol w:w="2260"/>
       </w:tblGrid>
       <w:tr>
         <w:trPr>
@@ -417,7 +417,7 @@
         </w:trPr>
         <w:tc>
           <w:tcPr>
-            <w:tcW w:type="dxa" w:w="1750"/>
+            <w:tcW w:type="dxa" w:w="2300"/>
             <w:vAlign w:val="center"/>
             <w:tcMar>
               <w:top w:w="100" w:type="dxa"/>
@@ -447,7 +447,7 @@
         </w:tc>
         <w:tc>
           <w:tcPr>
-            <w:tcW w:type="dxa" w:w="1700"/>
+            <w:tcW w:type="dxa" w:w="1800"/>
             <w:vAlign w:val="center"/>
             <w:tcMar>
               <w:top w:w="100" w:type="dxa"/>
@@ -477,7 +477,7 @@
         </w:tc>
         <w:tc>
           <w:tcPr>
-            <w:tcW w:type="dxa" w:w="3550"/>
+            <w:tcW w:type="dxa" w:w="3000"/>
             <w:vAlign w:val="center"/>
             <w:tcMar>
               <w:top w:w="100" w:type="dxa"/>
@@ -507,7 +507,7 @@
         </w:tc>
         <w:tc>
           <w:tcPr>
-            <w:tcW w:type="dxa" w:w="2360"/>
+            <w:tcW w:type="dxa" w:w="2260"/>
             <w:vAlign w:val="center"/>
             <w:tcMar>
               <w:top w:w="100" w:type="dxa"/>
@@ -539,7 +539,7 @@
       <w:tr>
         <w:tc>
           <w:tcPr>
-            <w:tcW w:type="dxa" w:w="1750"/>
+            <w:tcW w:type="dxa" w:w="2300"/>
             <w:vAlign w:val="center"/>
             <w:tcMar>
               <w:top w:w="100" w:type="dxa"/>
@@ -562,13 +562,13 @@
                 <w:sz w:val="21"/>
                 <w:lang w:val="ru-RU"/>
               </w:rPr>
-              <w:t>Мусиенко М. В.</w:t>
+              <w:t>Мусиенко Матвей Валерьевич</w:t>
             </w:r>
           </w:p>
         </w:tc>
         <w:tc>
           <w:tcPr>
-            <w:tcW w:type="dxa" w:w="1700"/>
+            <w:tcW w:type="dxa" w:w="1800"/>
             <w:vAlign w:val="center"/>
             <w:tcMar>
               <w:top w:w="100" w:type="dxa"/>
@@ -597,7 +597,7 @@
         </w:tc>
         <w:tc>
           <w:tcPr>
-            <w:tcW w:type="dxa" w:w="3550"/>
+            <w:tcW w:type="dxa" w:w="3000"/>
             <w:vAlign w:val="center"/>
             <w:tcMar>
               <w:top w:w="100" w:type="dxa"/>
@@ -626,7 +626,7 @@
         </w:tc>
         <w:tc>
           <w:tcPr>
-            <w:tcW w:type="dxa" w:w="2360"/>
+            <w:tcW w:type="dxa" w:w="2260"/>
             <w:vAlign w:val="center"/>
             <w:tcMar>
               <w:top w:w="100" w:type="dxa"/>
@@ -649,7 +649,7 @@
                 <w:sz w:val="21"/>
                 <w:lang w:val="ru-RU"/>
               </w:rPr>
-              <w:t>Реализует новую функцию и тесты</w:t>
+              <w:t>Реализовал новую функцию, тесты и артефакты</w:t>
             </w:r>
           </w:p>
         </w:tc>
@@ -657,7 +657,7 @@
       <w:tr>
         <w:tc>
           <w:tcPr>
-            <w:tcW w:type="dxa" w:w="1750"/>
+            <w:tcW w:type="dxa" w:w="2300"/>
             <w:vAlign w:val="center"/>
             <w:tcMar>
               <w:top w:w="100" w:type="dxa"/>
@@ -680,367 +680,13 @@
                 <w:sz w:val="21"/>
                 <w:lang w:val="ru-RU"/>
               </w:rPr>
-              <w:t>Разуваев М. А.</w:t>
+              <w:t>Талошный Захар Павлович</w:t>
             </w:r>
           </w:p>
         </w:tc>
         <w:tc>
           <w:tcPr>
-            <w:tcW w:type="dxa" w:w="1700"/>
-            <w:vAlign w:val="center"/>
-            <w:tcMar>
-              <w:top w:w="100" w:type="dxa"/>
-              <w:start w:w="120" w:type="dxa"/>
-              <w:bottom w:w="100" w:type="dxa"/>
-              <w:end w:w="120" w:type="dxa"/>
-            </w:tcMar>
-          </w:tcPr>
-          <w:p>
-            <w:pPr>
-              <w:spacing w:before="0" w:after="0" w:line="276" w:lineRule="auto"/>
-              <w:ind w:firstLine="0"/>
-              <w:jc w:val="left"/>
-            </w:pPr>
-            <w:r>
-              <w:rPr>
-                <w:rFonts w:ascii="Times New Roman" w:hAnsi="Times New Roman" w:eastAsia="Times New Roman"/>
-                <w:b w:val="0"/>
-                <w:color w:val="000000"/>
-                <w:sz w:val="21"/>
-                <w:lang w:val="ru-RU"/>
-              </w:rPr>
-              <w:t>UX/UI-проектировщик</w:t>
-            </w:r>
-          </w:p>
-        </w:tc>
-        <w:tc>
-          <w:tcPr>
-            <w:tcW w:type="dxa" w:w="3550"/>
-            <w:vAlign w:val="center"/>
-            <w:tcMar>
-              <w:top w:w="100" w:type="dxa"/>
-              <w:start w:w="120" w:type="dxa"/>
-              <w:bottom w:w="100" w:type="dxa"/>
-              <w:end w:w="120" w:type="dxa"/>
-            </w:tcMar>
-          </w:tcPr>
-          <w:p>
-            <w:pPr>
-              <w:spacing w:before="0" w:after="0" w:line="276" w:lineRule="auto"/>
-              <w:ind w:firstLine="0"/>
-              <w:jc w:val="left"/>
-            </w:pPr>
-            <w:r>
-              <w:rPr>
-                <w:rFonts w:ascii="Times New Roman" w:hAnsi="Times New Roman" w:eastAsia="Times New Roman"/>
-                <w:b w:val="0"/>
-                <w:color w:val="000000"/>
-                <w:sz w:val="21"/>
-                <w:lang w:val="ru-RU"/>
-              </w:rPr>
-              <w:t>Пользовательские сценарии, структура и визуальные решения</w:t>
-            </w:r>
-          </w:p>
-        </w:tc>
-        <w:tc>
-          <w:tcPr>
-            <w:tcW w:type="dxa" w:w="2360"/>
-            <w:vAlign w:val="center"/>
-            <w:tcMar>
-              <w:top w:w="100" w:type="dxa"/>
-              <w:start w:w="120" w:type="dxa"/>
-              <w:bottom w:w="100" w:type="dxa"/>
-              <w:end w:w="120" w:type="dxa"/>
-            </w:tcMar>
-          </w:tcPr>
-          <w:p>
-            <w:pPr>
-              <w:spacing w:before="0" w:after="0" w:line="276" w:lineRule="auto"/>
-              <w:ind w:firstLine="0"/>
-              <w:jc w:val="left"/>
-            </w:pPr>
-            <w:r>
-              <w:rPr>
-                <w:rFonts w:ascii="Times New Roman" w:hAnsi="Times New Roman" w:eastAsia="Times New Roman"/>
-                <w:b w:val="0"/>
-                <w:color w:val="000000"/>
-                <w:sz w:val="21"/>
-                <w:lang w:val="ru-RU"/>
-              </w:rPr>
-              <w:t>Существующая дизайн-система сохранена</w:t>
-            </w:r>
-          </w:p>
-        </w:tc>
-      </w:tr>
-      <w:tr>
-        <w:tc>
-          <w:tcPr>
-            <w:tcW w:type="dxa" w:w="1750"/>
-            <w:vAlign w:val="center"/>
-            <w:tcMar>
-              <w:top w:w="100" w:type="dxa"/>
-              <w:start w:w="120" w:type="dxa"/>
-              <w:bottom w:w="100" w:type="dxa"/>
-              <w:end w:w="120" w:type="dxa"/>
-            </w:tcMar>
-          </w:tcPr>
-          <w:p>
-            <w:pPr>
-              <w:spacing w:before="0" w:after="0" w:line="276" w:lineRule="auto"/>
-              <w:ind w:firstLine="0"/>
-              <w:jc w:val="left"/>
-            </w:pPr>
-            <w:r>
-              <w:rPr>
-                <w:rFonts w:ascii="Times New Roman" w:hAnsi="Times New Roman" w:eastAsia="Times New Roman"/>
-                <w:b w:val="0"/>
-                <w:color w:val="000000"/>
-                <w:sz w:val="21"/>
-                <w:lang w:val="ru-RU"/>
-              </w:rPr>
-              <w:t>Скляр А. М.</w:t>
-            </w:r>
-          </w:p>
-        </w:tc>
-        <w:tc>
-          <w:tcPr>
-            <w:tcW w:type="dxa" w:w="1700"/>
-            <w:vAlign w:val="center"/>
-            <w:tcMar>
-              <w:top w:w="100" w:type="dxa"/>
-              <w:start w:w="120" w:type="dxa"/>
-              <w:bottom w:w="100" w:type="dxa"/>
-              <w:end w:w="120" w:type="dxa"/>
-            </w:tcMar>
-          </w:tcPr>
-          <w:p>
-            <w:pPr>
-              <w:spacing w:before="0" w:after="0" w:line="276" w:lineRule="auto"/>
-              <w:ind w:firstLine="0"/>
-              <w:jc w:val="left"/>
-            </w:pPr>
-            <w:r>
-              <w:rPr>
-                <w:rFonts w:ascii="Times New Roman" w:hAnsi="Times New Roman" w:eastAsia="Times New Roman"/>
-                <w:b w:val="0"/>
-                <w:color w:val="000000"/>
-                <w:sz w:val="21"/>
-                <w:lang w:val="ru-RU"/>
-              </w:rPr>
-              <w:t>DevSecOps</w:t>
-            </w:r>
-          </w:p>
-        </w:tc>
-        <w:tc>
-          <w:tcPr>
-            <w:tcW w:type="dxa" w:w="3550"/>
-            <w:vAlign w:val="center"/>
-            <w:tcMar>
-              <w:top w:w="100" w:type="dxa"/>
-              <w:start w:w="120" w:type="dxa"/>
-              <w:bottom w:w="100" w:type="dxa"/>
-              <w:end w:w="120" w:type="dxa"/>
-            </w:tcMar>
-          </w:tcPr>
-          <w:p>
-            <w:pPr>
-              <w:spacing w:before="0" w:after="0" w:line="276" w:lineRule="auto"/>
-              <w:ind w:firstLine="0"/>
-              <w:jc w:val="left"/>
-            </w:pPr>
-            <w:r>
-              <w:rPr>
-                <w:rFonts w:ascii="Times New Roman" w:hAnsi="Times New Roman" w:eastAsia="Times New Roman"/>
-                <w:b w:val="0"/>
-                <w:color w:val="000000"/>
-                <w:sz w:val="21"/>
-                <w:lang w:val="ru-RU"/>
-              </w:rPr>
-              <w:t>Docker, Nginx, CI/CD и инфраструктурная безопасность</w:t>
-            </w:r>
-          </w:p>
-        </w:tc>
-        <w:tc>
-          <w:tcPr>
-            <w:tcW w:type="dxa" w:w="2360"/>
-            <w:vAlign w:val="center"/>
-            <w:tcMar>
-              <w:top w:w="100" w:type="dxa"/>
-              <w:start w:w="120" w:type="dxa"/>
-              <w:bottom w:w="100" w:type="dxa"/>
-              <w:end w:w="120" w:type="dxa"/>
-            </w:tcMar>
-          </w:tcPr>
-          <w:p>
-            <w:pPr>
-              <w:spacing w:before="0" w:after="0" w:line="276" w:lineRule="auto"/>
-              <w:ind w:firstLine="0"/>
-              <w:jc w:val="left"/>
-            </w:pPr>
-            <w:r>
-              <w:rPr>
-                <w:rFonts w:ascii="Times New Roman" w:hAnsi="Times New Roman" w:eastAsia="Times New Roman"/>
-                <w:b w:val="0"/>
-                <w:color w:val="000000"/>
-                <w:sz w:val="21"/>
-                <w:lang w:val="ru-RU"/>
-              </w:rPr>
-              <w:t>Топология развёртывания не изменяется</w:t>
-            </w:r>
-          </w:p>
-        </w:tc>
-      </w:tr>
-      <w:tr>
-        <w:tc>
-          <w:tcPr>
-            <w:tcW w:type="dxa" w:w="1750"/>
-            <w:vAlign w:val="center"/>
-            <w:tcMar>
-              <w:top w:w="100" w:type="dxa"/>
-              <w:start w:w="120" w:type="dxa"/>
-              <w:bottom w:w="100" w:type="dxa"/>
-              <w:end w:w="120" w:type="dxa"/>
-            </w:tcMar>
-          </w:tcPr>
-          <w:p>
-            <w:pPr>
-              <w:spacing w:before="0" w:after="0" w:line="276" w:lineRule="auto"/>
-              <w:ind w:firstLine="0"/>
-              <w:jc w:val="left"/>
-            </w:pPr>
-            <w:r>
-              <w:rPr>
-                <w:rFonts w:ascii="Times New Roman" w:hAnsi="Times New Roman" w:eastAsia="Times New Roman"/>
-                <w:b w:val="0"/>
-                <w:color w:val="000000"/>
-                <w:sz w:val="21"/>
-                <w:lang w:val="ru-RU"/>
-              </w:rPr>
-              <w:t>Склярова А. А.</w:t>
-            </w:r>
-          </w:p>
-        </w:tc>
-        <w:tc>
-          <w:tcPr>
-            <w:tcW w:type="dxa" w:w="1700"/>
-            <w:vAlign w:val="center"/>
-            <w:tcMar>
-              <w:top w:w="100" w:type="dxa"/>
-              <w:start w:w="120" w:type="dxa"/>
-              <w:bottom w:w="100" w:type="dxa"/>
-              <w:end w:w="120" w:type="dxa"/>
-            </w:tcMar>
-          </w:tcPr>
-          <w:p>
-            <w:pPr>
-              <w:spacing w:before="0" w:after="0" w:line="276" w:lineRule="auto"/>
-              <w:ind w:firstLine="0"/>
-              <w:jc w:val="left"/>
-            </w:pPr>
-            <w:r>
-              <w:rPr>
-                <w:rFonts w:ascii="Times New Roman" w:hAnsi="Times New Roman" w:eastAsia="Times New Roman"/>
-                <w:b w:val="0"/>
-                <w:color w:val="000000"/>
-                <w:sz w:val="21"/>
-                <w:lang w:val="ru-RU"/>
-              </w:rPr>
-              <w:t>Системный аналитик / TL</w:t>
-            </w:r>
-          </w:p>
-        </w:tc>
-        <w:tc>
-          <w:tcPr>
-            <w:tcW w:type="dxa" w:w="3550"/>
-            <w:vAlign w:val="center"/>
-            <w:tcMar>
-              <w:top w:w="100" w:type="dxa"/>
-              <w:start w:w="120" w:type="dxa"/>
-              <w:bottom w:w="100" w:type="dxa"/>
-              <w:end w:w="120" w:type="dxa"/>
-            </w:tcMar>
-          </w:tcPr>
-          <w:p>
-            <w:pPr>
-              <w:spacing w:before="0" w:after="0" w:line="276" w:lineRule="auto"/>
-              <w:ind w:firstLine="0"/>
-              <w:jc w:val="left"/>
-            </w:pPr>
-            <w:r>
-              <w:rPr>
-                <w:rFonts w:ascii="Times New Roman" w:hAnsi="Times New Roman" w:eastAsia="Times New Roman"/>
-                <w:b w:val="0"/>
-                <w:color w:val="000000"/>
-                <w:sz w:val="21"/>
-                <w:lang w:val="ru-RU"/>
-              </w:rPr>
-              <w:t>Требования, декомпозиция, координация и документация</w:t>
-            </w:r>
-          </w:p>
-        </w:tc>
-        <w:tc>
-          <w:tcPr>
-            <w:tcW w:type="dxa" w:w="2360"/>
-            <w:vAlign w:val="center"/>
-            <w:tcMar>
-              <w:top w:w="100" w:type="dxa"/>
-              <w:start w:w="120" w:type="dxa"/>
-              <w:bottom w:w="100" w:type="dxa"/>
-              <w:end w:w="120" w:type="dxa"/>
-            </w:tcMar>
-          </w:tcPr>
-          <w:p>
-            <w:pPr>
-              <w:spacing w:before="0" w:after="0" w:line="276" w:lineRule="auto"/>
-              <w:ind w:firstLine="0"/>
-              <w:jc w:val="left"/>
-            </w:pPr>
-            <w:r>
-              <w:rPr>
-                <w:rFonts w:ascii="Times New Roman" w:hAnsi="Times New Roman" w:eastAsia="Times New Roman"/>
-                <w:b w:val="0"/>
-                <w:color w:val="000000"/>
-                <w:sz w:val="21"/>
-                <w:lang w:val="ru-RU"/>
-              </w:rPr>
-              <w:t>Используются согласованные сущности MVP</w:t>
-            </w:r>
-          </w:p>
-        </w:tc>
-      </w:tr>
-      <w:tr>
-        <w:tc>
-          <w:tcPr>
-            <w:tcW w:type="dxa" w:w="1750"/>
-            <w:vAlign w:val="center"/>
-            <w:tcMar>
-              <w:top w:w="100" w:type="dxa"/>
-              <w:start w:w="120" w:type="dxa"/>
-              <w:bottom w:w="100" w:type="dxa"/>
-              <w:end w:w="120" w:type="dxa"/>
-            </w:tcMar>
-          </w:tcPr>
-          <w:p>
-            <w:pPr>
-              <w:spacing w:before="0" w:after="0" w:line="276" w:lineRule="auto"/>
-              <w:ind w:firstLine="0"/>
-              <w:jc w:val="left"/>
-            </w:pPr>
-            <w:r>
-              <w:rPr>
-                <w:rFonts w:ascii="Times New Roman" w:hAnsi="Times New Roman" w:eastAsia="Times New Roman"/>
-                <w:b w:val="0"/>
-                <w:color w:val="000000"/>
-                <w:sz w:val="21"/>
-                <w:lang w:val="ru-RU"/>
-              </w:rPr>
-              <w:t>Толошный З. П.</w:t>
-            </w:r>
-          </w:p>
-        </w:tc>
-        <w:tc>
-          <w:tcPr>
-            <w:tcW w:type="dxa" w:w="1700"/>
+            <w:tcW w:type="dxa" w:w="1800"/>
             <w:vAlign w:val="center"/>
             <w:tcMar>
               <w:top w:w="100" w:type="dxa"/>
@@ -1069,7 +715,7 @@
         </w:tc>
         <w:tc>
           <w:tcPr>
-            <w:tcW w:type="dxa" w:w="3550"/>
+            <w:tcW w:type="dxa" w:w="3000"/>
             <w:vAlign w:val="center"/>
             <w:tcMar>
               <w:top w:w="100" w:type="dxa"/>
@@ -1092,13 +738,13 @@
                 <w:sz w:val="21"/>
                 <w:lang w:val="ru-RU"/>
               </w:rPr>
-              <w:t>Fastify API, PostgreSQL, Redis и бизнес-правила</w:t>
+              <w:t>Fastify API, PostgreSQL, Redis и серверные бизнес-правила</w:t>
             </w:r>
           </w:p>
         </w:tc>
         <w:tc>
           <w:tcPr>
-            <w:tcW w:type="dxa" w:w="2360"/>
+            <w:tcW w:type="dxa" w:w="2260"/>
             <w:vAlign w:val="center"/>
             <w:tcMar>
               <w:top w:w="100" w:type="dxa"/>
@@ -1121,7 +767,125 @@
                 <w:sz w:val="21"/>
                 <w:lang w:val="ru-RU"/>
               </w:rPr>
-              <w:t>Повторно используются готовые методы API</w:t>
+              <w:t>Готовые методы API используются без изменений</w:t>
+            </w:r>
+          </w:p>
+        </w:tc>
+      </w:tr>
+      <w:tr>
+        <w:tc>
+          <w:tcPr>
+            <w:tcW w:type="dxa" w:w="2300"/>
+            <w:vAlign w:val="center"/>
+            <w:tcMar>
+              <w:top w:w="100" w:type="dxa"/>
+              <w:start w:w="120" w:type="dxa"/>
+              <w:bottom w:w="100" w:type="dxa"/>
+              <w:end w:w="120" w:type="dxa"/>
+            </w:tcMar>
+          </w:tcPr>
+          <w:p>
+            <w:pPr>
+              <w:spacing w:before="0" w:after="0" w:line="276" w:lineRule="auto"/>
+              <w:ind w:firstLine="0"/>
+              <w:jc w:val="left"/>
+            </w:pPr>
+            <w:r>
+              <w:rPr>
+                <w:rFonts w:ascii="Times New Roman" w:hAnsi="Times New Roman" w:eastAsia="Times New Roman"/>
+                <w:b w:val="0"/>
+                <w:color w:val="000000"/>
+                <w:sz w:val="21"/>
+                <w:lang w:val="ru-RU"/>
+              </w:rPr>
+              <w:t>Белов Андрей</w:t>
+            </w:r>
+          </w:p>
+        </w:tc>
+        <w:tc>
+          <w:tcPr>
+            <w:tcW w:type="dxa" w:w="1800"/>
+            <w:vAlign w:val="center"/>
+            <w:tcMar>
+              <w:top w:w="100" w:type="dxa"/>
+              <w:start w:w="120" w:type="dxa"/>
+              <w:bottom w:w="100" w:type="dxa"/>
+              <w:end w:w="120" w:type="dxa"/>
+            </w:tcMar>
+          </w:tcPr>
+          <w:p>
+            <w:pPr>
+              <w:spacing w:before="0" w:after="0" w:line="276" w:lineRule="auto"/>
+              <w:ind w:firstLine="0"/>
+              <w:jc w:val="left"/>
+            </w:pPr>
+            <w:r>
+              <w:rPr>
+                <w:rFonts w:ascii="Times New Roman" w:hAnsi="Times New Roman" w:eastAsia="Times New Roman"/>
+                <w:b w:val="0"/>
+                <w:color w:val="000000"/>
+                <w:sz w:val="21"/>
+                <w:lang w:val="ru-RU"/>
+              </w:rPr>
+              <w:t>Аналитик</w:t>
+            </w:r>
+          </w:p>
+        </w:tc>
+        <w:tc>
+          <w:tcPr>
+            <w:tcW w:type="dxa" w:w="3000"/>
+            <w:vAlign w:val="center"/>
+            <w:tcMar>
+              <w:top w:w="100" w:type="dxa"/>
+              <w:start w:w="120" w:type="dxa"/>
+              <w:bottom w:w="100" w:type="dxa"/>
+              <w:end w:w="120" w:type="dxa"/>
+            </w:tcMar>
+          </w:tcPr>
+          <w:p>
+            <w:pPr>
+              <w:spacing w:before="0" w:after="0" w:line="276" w:lineRule="auto"/>
+              <w:ind w:firstLine="0"/>
+              <w:jc w:val="left"/>
+            </w:pPr>
+            <w:r>
+              <w:rPr>
+                <w:rFonts w:ascii="Times New Roman" w:hAnsi="Times New Roman" w:eastAsia="Times New Roman"/>
+                <w:b w:val="0"/>
+                <w:color w:val="000000"/>
+                <w:sz w:val="21"/>
+                <w:lang w:val="ru-RU"/>
+              </w:rPr>
+              <w:t>Требования, описание AS IS и TO BE, критерии приёмки</w:t>
+            </w:r>
+          </w:p>
+        </w:tc>
+        <w:tc>
+          <w:tcPr>
+            <w:tcW w:type="dxa" w:w="2260"/>
+            <w:vAlign w:val="center"/>
+            <w:tcMar>
+              <w:top w:w="100" w:type="dxa"/>
+              <w:start w:w="120" w:type="dxa"/>
+              <w:bottom w:w="100" w:type="dxa"/>
+              <w:end w:w="120" w:type="dxa"/>
+            </w:tcMar>
+          </w:tcPr>
+          <w:p>
+            <w:pPr>
+              <w:spacing w:before="0" w:after="0" w:line="276" w:lineRule="auto"/>
+              <w:ind w:firstLine="0"/>
+              <w:jc w:val="left"/>
+            </w:pPr>
+            <w:r>
+              <w:rPr>
+                <w:rFonts w:ascii="Times New Roman" w:hAnsi="Times New Roman" w:eastAsia="Times New Roman"/>
+                <w:b w:val="0"/>
+                <w:color w:val="000000"/>
+                <w:sz w:val="21"/>
+                <w:lang w:val="ru-RU"/>
+              </w:rPr>
+              <w:t>Согласовал пользовательский сценарий итерации</w:t>
             </w:r>
           </w:p>
         </w:tc>
@@ -1205,7 +969,7 @@
         <w:pStyle w:val="Caption"/>
       </w:pPr>
       <w:r>
-        <w:t>Рисунок 1 — Рабочая область владельца проекта до итерации</w:t>
+        <w:t>Рисунок 1 — Артефакт AS IS: рабочая область до итерации</w:t>
       </w:r>
     </w:p>
     <w:p>
@@ -1921,7 +1685,7 @@
         <w:pStyle w:val="Caption"/>
       </w:pPr>
       <w:r>
-        <w:t>Рисунок 2 — Ранжированный список кандидатов в состоянии TO BE</w:t>
+        <w:t>Рисунок 2 — Артефакт TO BE: ранжированный список кандидатов</w:t>
       </w:r>
     </w:p>
     <w:p>
@@ -1989,7 +1753,7 @@
         <w:pStyle w:val="Caption"/>
       </w:pPr>
       <w:r>
-        <w:t>Рисунок 3 — Фильтрация кандидатов по навыку React</w:t>
+        <w:t>Рисунок 3 — Артефакт проверки: фильтрация по навыку React</w:t>
       </w:r>
     </w:p>
     <w:p>
@@ -2044,7 +1808,7 @@
         <w:pStyle w:val="Caption"/>
       </w:pPr>
       <w:r>
-        <w:t>Рисунок 4 — Мобильная карточка кандидата</w:t>
+        <w:t>Рисунок 4 — Артефакт адаптивности: мобильная карточка</w:t>
       </w:r>
     </w:p>
     <w:p>
@@ -2062,7 +1826,7 @@
     </w:p>
     <w:p>
       <w:r>
-        <w:t>В результате итерации в Teamnova появился новый законченный пользовательский сценарий. Владелец проекта может перейти из рабочей области на отдельный экран, увидеть три демо-профиля в ожидаемом порядке, понять основания оценки, выполнить поиск и открыть почтовый клиент с темой выбранного проекта. Сценарий работает поверх текущего API и не нарушает существующий цикл заявок.</w:t>
+        <w:t>В результате очередной итерации проекта Teamnova, который команда ChamBucket продолжает после проектного практикума, появился новый законченный пользовательский сценарий. Владелец проекта может перейти из рабочей области на отдельный экран, увидеть три демо-профиля в ожидаемом порядке, понять основания оценки, выполнить поиск и открыть почтовый клиент с темой выбранного проекта. Сценарий работает поверх текущего API и не нарушает существующий цикл заявок.</w:t>
       </w:r>
     </w:p>
     <w:p>

</xml_diff>

<commit_message>
docs(practice): rewrite report in first person
</commit_message>
<xml_diff>
--- a/docs/practice-report/teamnova-summer-practice-report.docx
+++ b/docs/practice-report/teamnova-summer-practice-report.docx
@@ -66,7 +66,7 @@
         <w:br/>
         <w:t>по требованиям проекта в веб-платформе Teamnova</w:t>
         <w:br/>
-        <w:t>Команда ChamBucket</w:t>
+        <w:t>Команда «Чамбакет»</w:t>
       </w:r>
     </w:p>
     <w:p>
@@ -348,7 +348,7 @@
     </w:p>
     <w:p>
       <w:r>
-        <w:t>Летняя проектная практика является продолжением проекта Teamnova, начатого командой ChamBucket в рамках проектного практикума. Новый проект с нуля не создавался, сторонний или заброшенный продукт не использовался: работа выполнялась в существующем репозитории и развивала уже реализованный MVP. Teamnova — веб-платформа для формирования проектных IT-команд.</w:t>
+        <w:t>В рамках летней проектной практики я продолжаю проект Teamnova, начатый командой «Чамбакет» на проектном практикуме. Я не создавал новый продукт с нуля и не использовал сторонний или заброшенный проект: моя работа выполнялась в существующем репозитории и развивала уже реализованный MVP. Teamnova — веб-платформа для формирования проектных IT-команд.</w:t>
       </w:r>
     </w:p>
     <w:p>
@@ -358,12 +358,12 @@
     </w:p>
     <w:p>
       <w:r>
-        <w:t>К началу итерации MVP уже поддерживал регистрацию, профиль, проекты, поиск, заявки и принятие участников. Однако сценарий владельца оставался реактивным: он мог только ждать отклики. Инструмента анализа доступных профилей применительно к конкретному проекту не существовало.</w:t>
+        <w:t>К началу моей итерации MVP уже поддерживал регистрацию, профиль, проекты, поиск, заявки и принятие участников. Однако сценарий владельца оставался реактивным: он мог только ждать отклики. Инструмента анализа доступных профилей применительно к конкретному проекту не существовало.</w:t>
       </w:r>
     </w:p>
     <w:p>
       <w:r>
-        <w:t>Цель индивидуальной работы — реализовать функцию «Подбор команды»: ранжировать участников по стеку и ролям проекта, объяснять результат, поддержать фильтрацию и переход к контакту без изменения server API. Для этого требовалось разработать типизированный алгоритм, защищённый маршрут, адаптивный экран и тесты, затем выполнить production build, browser smoke и подготовить отчётные артефакты.</w:t>
+        <w:t>Цель моей индивидуальной работы — реализовать frontend-функцию «Подбор команды»: ранжировать участников по стеку и ролям проекта, объяснять результат, поддержать фильтрацию и переход к контакту без изменения server API. Для этого я подготовил типизированный алгоритм, защищённый маршрут, адаптивный экран и тесты, затем выполнил production build, browser smoke и оформил отчётные артефакты.</w:t>
       </w:r>
     </w:p>
     <w:p>
@@ -381,12 +381,12 @@
     </w:p>
     <w:p>
       <w:r>
-        <w:t>Teamnova — full-stack веб-приложение для поиска IT-проектов, специалистов и формирования команд. Центральными сущностями являются пользователь, профиль, навык, проект и заявка. В рамках летней практики команда ChamBucket продолжает разработку того же проекта после проектного практикума: сохраняются существующая кодовая база, архитектура и пользовательские сценарии, а MVP расширяется отдельной frontend-функцией.</w:t>
+        <w:t>Teamnova — full-stack веб-приложение для поиска IT-проектов, специалистов и формирования команд. Центральными сущностями являются пользователь, профиль, навык, проект и заявка. В составе команды «Чамбакет» я продолжаю тот же проект после проектного практикума: сохраняю существующую кодовую базу, архитектуру и пользовательские сценарии, а MVP расширяю отдельной frontend-функцией.</w:t>
       </w:r>
     </w:p>
     <w:p>
       <w:r>
-        <w:t>Актуальный состав ChamBucket включает frontend-разработчика, backend-разработчика и аналитика. В данной итерации изменения сосредоточены в индивидуальной frontend-зоне Матвея Мусиенко; готовые серверные контракты и согласованные требования используются как границы реализации.</w:t>
+        <w:t>В команде «Чамбакет» я отвечаю за frontend-разработку; Захар Толошный — за backend, Андрей Белов — за аналитику. В своей итерации я не изменял серверные контракты и базу данных, а использовал согласованные требования и готовый API как границы реализации.</w:t>
       </w:r>
     </w:p>
     <w:p>
@@ -394,7 +394,7 @@
         <w:pStyle w:val="Caption"/>
       </w:pPr>
       <w:r>
-        <w:t>Таблица 1 — Матрица ответственности команды ChamBucket</w:t>
+        <w:t>Таблица 1 — Матрица ответственности команды «Чамбакет»</w:t>
       </w:r>
     </w:p>
     <w:tbl>
@@ -680,7 +680,7 @@
                 <w:sz w:val="21"/>
                 <w:lang w:val="ru-RU"/>
               </w:rPr>
-              <w:t>Талошный Захар Павлович</w:t>
+              <w:t>Толошный Захар Павлович</w:t>
             </w:r>
           </w:p>
         </w:tc>
@@ -914,12 +914,12 @@
     </w:p>
     <w:p>
       <w:r>
-        <w:t>Зона ответственности автора отчёта — клиентская часть приложения. До начала итерации владелец видел список собственных проектов, состав уже принятой команды и входящие заявки. Общий поиск был ориентирован прежде всего на участника: пользователь находил проект и отправлял отклик. В карточке собственного проекта присутствовали только действия редактирования и удаления.</w:t>
+        <w:t>Моя зона ответственности — клиентская часть приложения. До начала моей итерации владелец видел список собственных проектов, состав уже принятой команды и входящие заявки. Общий поиск был ориентирован прежде всего на участника: пользователь находил проект и отправлял отклик. В карточке собственного проекта присутствовали только действия редактирования и удаления.</w:t>
       </w:r>
     </w:p>
     <w:p>
       <w:r>
-        <w:t>Таким образом, владелец не мог выбрать проект и получить отдельный список потенциально подходящих профилей. Для оценки участников требовалось вручную переходить в общий поиск, читать описания и сопоставлять навыки со стеком проекта. На рисунке 1 зафиксировано исходное состояние интерфейса до реализации новой функции.</w:t>
+        <w:t>Я зафиксировал, что владелец не мог выбрать проект и получить отдельный список потенциально подходящих профилей. Для оценки участников требовалось вручную переходить в общий поиск, читать описания и сопоставлять навыки со стеком проекта. На рисунке 1 показано исходное состояние интерфейса до моей доработки.</w:t>
       </w:r>
     </w:p>
     <w:p>
@@ -987,12 +987,12 @@
     </w:p>
     <w:p>
       <w:r>
-        <w:t>В состоянии TO BE карточка проекта содержит действие «Подобрать команду», которое открывает защищённый маршрут /projects/:id/candidates. Экран показывает требования, число профилей и ранжированный список. Для кандидата выводятся процент, совпавшие технологии, роль, описание и навыки.</w:t>
+        <w:t>В состоянии TO BE я добавил в карточку проекта действие «Подобрать команду», которое открывает защищённый маршрут /projects/:id/candidates. На экране я показываю требования, число профилей и ранжированный список; для каждого кандидата — процент, совпавшие технологии, роль, описание и навыки.</w:t>
       </w:r>
     </w:p>
     <w:p>
       <w:r>
-        <w:t>Владелец получает проактивный сценарий и сразу видит основания рейтинга. Процент не выглядит результатом непрозрачной модели: интерфейс называет конкретные совпадения, а при их отсутствии показывает явное объяснение.</w:t>
+        <w:t>Так я перевёл сценарий владельца из реактивного в проактивный: пользователь сразу видит основания рейтинга, а при отсутствии совпадений получает явное объяснение.</w:t>
       </w:r>
     </w:p>
     <w:p>
@@ -1005,7 +1005,7 @@
         <w:ind w:firstLine="0" w:left="709"/>
       </w:pPr>
       <w:r>
-        <w:t>Новый сценарий не изменяет регистрацию, профиль, проекты, заявки и состав команды.</w:t>
+        <w:t>Я не изменял регистрацию, профиль, проекты, заявки и состав команды.</w:t>
       </w:r>
     </w:p>
     <w:p>
@@ -1018,7 +1018,7 @@
         <w:ind w:firstLine="0" w:left="709"/>
       </w:pPr>
       <w:r>
-        <w:t>Backend API и схема PostgreSQL остаются совместимыми с текущей версией.</w:t>
+        <w:t>Я использовал существующие Backend API и схему PostgreSQL без изменений.</w:t>
       </w:r>
     </w:p>
     <w:p>
@@ -1031,7 +1031,7 @@
         <w:ind w:firstLine="0" w:left="709"/>
       </w:pPr>
       <w:r>
-        <w:t>Поиск и фильтр выполняются локально над уже загруженным набором профилей.</w:t>
+        <w:t>Поиск и фильтр я выполняю локально над загруженными профилями.</w:t>
       </w:r>
     </w:p>
     <w:p>
@@ -1051,9 +1051,9 @@
         <w:tblInd w:w="120" w:type="dxa"/>
       </w:tblPr>
       <w:tblGrid>
-        <w:gridCol w:w="1900"/>
-        <w:gridCol w:w="3000"/>
-        <w:gridCol w:w="4460"/>
+        <w:gridCol w:w="1450"/>
+        <w:gridCol w:w="4050"/>
+        <w:gridCol w:w="3860"/>
       </w:tblGrid>
       <w:tr>
         <w:trPr>
@@ -1061,7 +1061,7 @@
         </w:trPr>
         <w:tc>
           <w:tcPr>
-            <w:tcW w:type="dxa" w:w="1900"/>
+            <w:tcW w:type="dxa" w:w="1450"/>
             <w:vAlign w:val="center"/>
             <w:tcMar>
               <w:top w:w="100" w:type="dxa"/>
@@ -1082,16 +1082,16 @@
                 <w:rFonts w:ascii="Times New Roman" w:hAnsi="Times New Roman" w:eastAsia="Times New Roman"/>
                 <w:b/>
                 <w:color w:val="000000"/>
-                <w:sz w:val="21"/>
+                <w:sz w:val="17"/>
                 <w:lang w:val="ru-RU"/>
               </w:rPr>
-              <w:t>Технология</w:t>
+              <w:t>Слой</w:t>
             </w:r>
           </w:p>
         </w:tc>
         <w:tc>
           <w:tcPr>
-            <w:tcW w:type="dxa" w:w="3000"/>
+            <w:tcW w:type="dxa" w:w="4050"/>
             <w:vAlign w:val="center"/>
             <w:tcMar>
               <w:top w:w="100" w:type="dxa"/>
@@ -1112,16 +1112,16 @@
                 <w:rFonts w:ascii="Times New Roman" w:hAnsi="Times New Roman" w:eastAsia="Times New Roman"/>
                 <w:b/>
                 <w:color w:val="000000"/>
-                <w:sz w:val="21"/>
+                <w:sz w:val="17"/>
                 <w:lang w:val="ru-RU"/>
               </w:rPr>
-              <w:t>Назначение</w:t>
+              <w:t>Фактические технологии</w:t>
             </w:r>
           </w:p>
         </w:tc>
         <w:tc>
           <w:tcPr>
-            <w:tcW w:type="dxa" w:w="4460"/>
+            <w:tcW w:type="dxa" w:w="3860"/>
             <w:vAlign w:val="center"/>
             <w:tcMar>
               <w:top w:w="100" w:type="dxa"/>
@@ -1142,10 +1142,10 @@
                 <w:rFonts w:ascii="Times New Roman" w:hAnsi="Times New Roman" w:eastAsia="Times New Roman"/>
                 <w:b/>
                 <w:color w:val="000000"/>
-                <w:sz w:val="21"/>
+                <w:sz w:val="17"/>
                 <w:lang w:val="ru-RU"/>
               </w:rPr>
-              <w:t>Применение в итерации</w:t>
+              <w:t>Как я использовал</w:t>
             </w:r>
           </w:p>
         </w:tc>
@@ -1153,7 +1153,7 @@
       <w:tr>
         <w:tc>
           <w:tcPr>
-            <w:tcW w:type="dxa" w:w="1900"/>
+            <w:tcW w:type="dxa" w:w="1450"/>
             <w:vAlign w:val="center"/>
             <w:tcMar>
               <w:top w:w="100" w:type="dxa"/>
@@ -1173,16 +1173,16 @@
                 <w:rFonts w:ascii="Times New Roman" w:hAnsi="Times New Roman" w:eastAsia="Times New Roman"/>
                 <w:b w:val="0"/>
                 <w:color w:val="000000"/>
-                <w:sz w:val="21"/>
+                <w:sz w:val="17"/>
                 <w:lang w:val="ru-RU"/>
               </w:rPr>
-              <w:t>React 18</w:t>
+              <w:t>Frontend</w:t>
             </w:r>
           </w:p>
         </w:tc>
         <w:tc>
           <w:tcPr>
-            <w:tcW w:type="dxa" w:w="3000"/>
+            <w:tcW w:type="dxa" w:w="4050"/>
             <w:vAlign w:val="center"/>
             <w:tcMar>
               <w:top w:w="100" w:type="dxa"/>
@@ -1202,16 +1202,16 @@
                 <w:rFonts w:ascii="Times New Roman" w:hAnsi="Times New Roman" w:eastAsia="Times New Roman"/>
                 <w:b w:val="0"/>
                 <w:color w:val="000000"/>
-                <w:sz w:val="21"/>
+                <w:sz w:val="17"/>
                 <w:lang w:val="ru-RU"/>
               </w:rPr>
-              <w:t>Компонентный интерфейс и состояние</w:t>
+              <w:t>React 18, React DOM, React Router 7, CSS, Manrope, Space Grotesk</w:t>
             </w:r>
           </w:p>
         </w:tc>
         <w:tc>
           <w:tcPr>
-            <w:tcW w:type="dxa" w:w="4460"/>
+            <w:tcW w:type="dxa" w:w="3860"/>
             <w:vAlign w:val="center"/>
             <w:tcMar>
               <w:top w:w="100" w:type="dxa"/>
@@ -1231,10 +1231,10 @@
                 <w:rFonts w:ascii="Times New Roman" w:hAnsi="Times New Roman" w:eastAsia="Times New Roman"/>
                 <w:b w:val="0"/>
                 <w:color w:val="000000"/>
-                <w:sz w:val="21"/>
+                <w:sz w:val="17"/>
                 <w:lang w:val="ru-RU"/>
               </w:rPr>
-              <w:t>Страница, загрузка, фильтры и empty states</w:t>
+              <w:t>Я реализовал страницу, состояние, маршрут, фильтры и адаптивную вёрстку</w:t>
             </w:r>
           </w:p>
         </w:tc>
@@ -1242,7 +1242,7 @@
       <w:tr>
         <w:tc>
           <w:tcPr>
-            <w:tcW w:type="dxa" w:w="1900"/>
+            <w:tcW w:type="dxa" w:w="1450"/>
             <w:vAlign w:val="center"/>
             <w:tcMar>
               <w:top w:w="100" w:type="dxa"/>
@@ -1262,16 +1262,16 @@
                 <w:rFonts w:ascii="Times New Roman" w:hAnsi="Times New Roman" w:eastAsia="Times New Roman"/>
                 <w:b w:val="0"/>
                 <w:color w:val="000000"/>
-                <w:sz w:val="21"/>
+                <w:sz w:val="17"/>
                 <w:lang w:val="ru-RU"/>
               </w:rPr>
-              <w:t>TypeScript 5</w:t>
+              <w:t>Сборка</w:t>
             </w:r>
           </w:p>
         </w:tc>
         <w:tc>
           <w:tcPr>
-            <w:tcW w:type="dxa" w:w="3000"/>
+            <w:tcW w:type="dxa" w:w="4050"/>
             <w:vAlign w:val="center"/>
             <w:tcMar>
               <w:top w:w="100" w:type="dxa"/>
@@ -1291,16 +1291,16 @@
                 <w:rFonts w:ascii="Times New Roman" w:hAnsi="Times New Roman" w:eastAsia="Times New Roman"/>
                 <w:b w:val="0"/>
                 <w:color w:val="000000"/>
-                <w:sz w:val="21"/>
+                <w:sz w:val="17"/>
                 <w:lang w:val="ru-RU"/>
               </w:rPr>
-              <w:t>Строгая типизация</w:t>
+              <w:t>TypeScript 5.8, Vite 5, Node.js 22, npm 11</w:t>
             </w:r>
           </w:p>
         </w:tc>
         <w:tc>
           <w:tcPr>
-            <w:tcW w:type="dxa" w:w="4460"/>
+            <w:tcW w:type="dxa" w:w="3860"/>
             <w:vAlign w:val="center"/>
             <w:tcMar>
               <w:top w:w="100" w:type="dxa"/>
@@ -1320,10 +1320,10 @@
                 <w:rFonts w:ascii="Times New Roman" w:hAnsi="Times New Roman" w:eastAsia="Times New Roman"/>
                 <w:b w:val="0"/>
                 <w:color w:val="000000"/>
-                <w:sz w:val="21"/>
+                <w:sz w:val="17"/>
                 <w:lang w:val="ru-RU"/>
               </w:rPr>
-              <w:t>Контракты CandidateMatch и чистые функции</w:t>
+              <w:t>Я типизировал код, запускал локальную среду и production build</w:t>
             </w:r>
           </w:p>
         </w:tc>
@@ -1331,7 +1331,7 @@
       <w:tr>
         <w:tc>
           <w:tcPr>
-            <w:tcW w:type="dxa" w:w="1900"/>
+            <w:tcW w:type="dxa" w:w="1450"/>
             <w:vAlign w:val="center"/>
             <w:tcMar>
               <w:top w:w="100" w:type="dxa"/>
@@ -1351,16 +1351,16 @@
                 <w:rFonts w:ascii="Times New Roman" w:hAnsi="Times New Roman" w:eastAsia="Times New Roman"/>
                 <w:b w:val="0"/>
                 <w:color w:val="000000"/>
-                <w:sz w:val="21"/>
+                <w:sz w:val="17"/>
                 <w:lang w:val="ru-RU"/>
               </w:rPr>
-              <w:t>React Router 7</w:t>
+              <w:t>Backend</w:t>
             </w:r>
           </w:p>
         </w:tc>
         <w:tc>
           <w:tcPr>
-            <w:tcW w:type="dxa" w:w="3000"/>
+            <w:tcW w:type="dxa" w:w="4050"/>
             <w:vAlign w:val="center"/>
             <w:tcMar>
               <w:top w:w="100" w:type="dxa"/>
@@ -1380,16 +1380,16 @@
                 <w:rFonts w:ascii="Times New Roman" w:hAnsi="Times New Roman" w:eastAsia="Times New Roman"/>
                 <w:b w:val="0"/>
                 <w:color w:val="000000"/>
-                <w:sz w:val="21"/>
+                <w:sz w:val="17"/>
                 <w:lang w:val="ru-RU"/>
               </w:rPr>
-              <w:t>Клиентская маршрутизация</w:t>
+              <w:t>Fastify 5, Zod 4, Pino, плагины @fastify</w:t>
             </w:r>
           </w:p>
         </w:tc>
         <w:tc>
           <w:tcPr>
-            <w:tcW w:type="dxa" w:w="4460"/>
+            <w:tcW w:type="dxa" w:w="3860"/>
             <w:vAlign w:val="center"/>
             <w:tcMar>
               <w:top w:w="100" w:type="dxa"/>
@@ -1409,10 +1409,10 @@
                 <w:rFonts w:ascii="Times New Roman" w:hAnsi="Times New Roman" w:eastAsia="Times New Roman"/>
                 <w:b w:val="0"/>
                 <w:color w:val="000000"/>
-                <w:sz w:val="21"/>
+                <w:sz w:val="17"/>
                 <w:lang w:val="ru-RU"/>
               </w:rPr>
-              <w:t>Защищённый динамический маршрут проекта</w:t>
+              <w:t>Я вызывал готовый API через ApiClient; backend-код не менял</w:t>
             </w:r>
           </w:p>
         </w:tc>
@@ -1420,7 +1420,7 @@
       <w:tr>
         <w:tc>
           <w:tcPr>
-            <w:tcW w:type="dxa" w:w="1900"/>
+            <w:tcW w:type="dxa" w:w="1450"/>
             <w:vAlign w:val="center"/>
             <w:tcMar>
               <w:top w:w="100" w:type="dxa"/>
@@ -1440,16 +1440,16 @@
                 <w:rFonts w:ascii="Times New Roman" w:hAnsi="Times New Roman" w:eastAsia="Times New Roman"/>
                 <w:b w:val="0"/>
                 <w:color w:val="000000"/>
-                <w:sz w:val="21"/>
+                <w:sz w:val="17"/>
                 <w:lang w:val="ru-RU"/>
               </w:rPr>
-              <w:t>CSS</w:t>
+              <w:t>Данные</w:t>
             </w:r>
           </w:p>
         </w:tc>
         <w:tc>
           <w:tcPr>
-            <w:tcW w:type="dxa" w:w="3000"/>
+            <w:tcW w:type="dxa" w:w="4050"/>
             <w:vAlign w:val="center"/>
             <w:tcMar>
               <w:top w:w="100" w:type="dxa"/>
@@ -1469,16 +1469,16 @@
                 <w:rFonts w:ascii="Times New Roman" w:hAnsi="Times New Roman" w:eastAsia="Times New Roman"/>
                 <w:b w:val="0"/>
                 <w:color w:val="000000"/>
-                <w:sz w:val="21"/>
+                <w:sz w:val="17"/>
                 <w:lang w:val="ru-RU"/>
               </w:rPr>
-              <w:t>Визуальная система и адаптивность</w:t>
+              <w:t>PostgreSQL, Drizzle ORM/Kit, Redis, ioredis</w:t>
             </w:r>
           </w:p>
         </w:tc>
         <w:tc>
           <w:tcPr>
-            <w:tcW w:type="dxa" w:w="4460"/>
+            <w:tcW w:type="dxa" w:w="3860"/>
             <w:vAlign w:val="center"/>
             <w:tcMar>
               <w:top w:w="100" w:type="dxa"/>
@@ -1498,10 +1498,277 @@
                 <w:rFonts w:ascii="Times New Roman" w:hAnsi="Times New Roman" w:eastAsia="Times New Roman"/>
                 <w:b w:val="0"/>
                 <w:color w:val="000000"/>
-                <w:sz w:val="21"/>
+                <w:sz w:val="17"/>
                 <w:lang w:val="ru-RU"/>
               </w:rPr>
-              <w:t>Рейтинг, карточки и mobile layout</w:t>
+              <w:t>Использовал косвенно через API; схему и миграции не менял</w:t>
+            </w:r>
+          </w:p>
+        </w:tc>
+      </w:tr>
+      <w:tr>
+        <w:tc>
+          <w:tcPr>
+            <w:tcW w:type="dxa" w:w="1450"/>
+            <w:vAlign w:val="center"/>
+            <w:tcMar>
+              <w:top w:w="100" w:type="dxa"/>
+              <w:start w:w="120" w:type="dxa"/>
+              <w:bottom w:w="100" w:type="dxa"/>
+              <w:end w:w="120" w:type="dxa"/>
+            </w:tcMar>
+          </w:tcPr>
+          <w:p>
+            <w:pPr>
+              <w:spacing w:before="0" w:after="0" w:line="276" w:lineRule="auto"/>
+              <w:ind w:firstLine="0"/>
+              <w:jc w:val="left"/>
+            </w:pPr>
+            <w:r>
+              <w:rPr>
+                <w:rFonts w:ascii="Times New Roman" w:hAnsi="Times New Roman" w:eastAsia="Times New Roman"/>
+                <w:b w:val="0"/>
+                <w:color w:val="000000"/>
+                <w:sz w:val="17"/>
+                <w:lang w:val="ru-RU"/>
+              </w:rPr>
+              <w:t>Безопасность</w:t>
+            </w:r>
+          </w:p>
+        </w:tc>
+        <w:tc>
+          <w:tcPr>
+            <w:tcW w:type="dxa" w:w="4050"/>
+            <w:vAlign w:val="center"/>
+            <w:tcMar>
+              <w:top w:w="100" w:type="dxa"/>
+              <w:start w:w="120" w:type="dxa"/>
+              <w:bottom w:w="100" w:type="dxa"/>
+              <w:end w:w="120" w:type="dxa"/>
+            </w:tcMar>
+          </w:tcPr>
+          <w:p>
+            <w:pPr>
+              <w:spacing w:before="0" w:after="0" w:line="276" w:lineRule="auto"/>
+              <w:ind w:firstLine="0"/>
+              <w:jc w:val="left"/>
+            </w:pPr>
+            <w:r>
+              <w:rPr>
+                <w:rFonts w:ascii="Times New Roman" w:hAnsi="Times New Roman" w:eastAsia="Times New Roman"/>
+                <w:b w:val="0"/>
+                <w:color w:val="000000"/>
+                <w:sz w:val="17"/>
+                <w:lang w:val="ru-RU"/>
+              </w:rPr>
+              <w:t>Argon2, JOSE/JWT, HttpOnly cookie, CORS, Helmet, rate-limit</w:t>
+            </w:r>
+          </w:p>
+        </w:tc>
+        <w:tc>
+          <w:tcPr>
+            <w:tcW w:type="dxa" w:w="3860"/>
+            <w:vAlign w:val="center"/>
+            <w:tcMar>
+              <w:top w:w="100" w:type="dxa"/>
+              <w:start w:w="120" w:type="dxa"/>
+              <w:bottom w:w="100" w:type="dxa"/>
+              <w:end w:w="120" w:type="dxa"/>
+            </w:tcMar>
+          </w:tcPr>
+          <w:p>
+            <w:pPr>
+              <w:spacing w:before="0" w:after="0" w:line="276" w:lineRule="auto"/>
+              <w:ind w:firstLine="0"/>
+              <w:jc w:val="left"/>
+            </w:pPr>
+            <w:r>
+              <w:rPr>
+                <w:rFonts w:ascii="Times New Roman" w:hAnsi="Times New Roman" w:eastAsia="Times New Roman"/>
+                <w:b w:val="0"/>
+                <w:color w:val="000000"/>
+                <w:sz w:val="17"/>
+                <w:lang w:val="ru-RU"/>
+              </w:rPr>
+              <w:t>Сохранил существующую авторизацию и ProtectedRoute</w:t>
+            </w:r>
+          </w:p>
+        </w:tc>
+      </w:tr>
+      <w:tr>
+        <w:tc>
+          <w:tcPr>
+            <w:tcW w:type="dxa" w:w="1450"/>
+            <w:vAlign w:val="center"/>
+            <w:tcMar>
+              <w:top w:w="100" w:type="dxa"/>
+              <w:start w:w="120" w:type="dxa"/>
+              <w:bottom w:w="100" w:type="dxa"/>
+              <w:end w:w="120" w:type="dxa"/>
+            </w:tcMar>
+          </w:tcPr>
+          <w:p>
+            <w:pPr>
+              <w:spacing w:before="0" w:after="0" w:line="276" w:lineRule="auto"/>
+              <w:ind w:firstLine="0"/>
+              <w:jc w:val="left"/>
+            </w:pPr>
+            <w:r>
+              <w:rPr>
+                <w:rFonts w:ascii="Times New Roman" w:hAnsi="Times New Roman" w:eastAsia="Times New Roman"/>
+                <w:b w:val="0"/>
+                <w:color w:val="000000"/>
+                <w:sz w:val="17"/>
+                <w:lang w:val="ru-RU"/>
+              </w:rPr>
+              <w:t>Инфраструктура</w:t>
+            </w:r>
+          </w:p>
+        </w:tc>
+        <w:tc>
+          <w:tcPr>
+            <w:tcW w:type="dxa" w:w="4050"/>
+            <w:vAlign w:val="center"/>
+            <w:tcMar>
+              <w:top w:w="100" w:type="dxa"/>
+              <w:start w:w="120" w:type="dxa"/>
+              <w:bottom w:w="100" w:type="dxa"/>
+              <w:end w:w="120" w:type="dxa"/>
+            </w:tcMar>
+          </w:tcPr>
+          <w:p>
+            <w:pPr>
+              <w:spacing w:before="0" w:after="0" w:line="276" w:lineRule="auto"/>
+              <w:ind w:firstLine="0"/>
+              <w:jc w:val="left"/>
+            </w:pPr>
+            <w:r>
+              <w:rPr>
+                <w:rFonts w:ascii="Times New Roman" w:hAnsi="Times New Roman" w:eastAsia="Times New Roman"/>
+                <w:b w:val="0"/>
+                <w:color w:val="000000"/>
+                <w:sz w:val="17"/>
+                <w:lang w:val="ru-RU"/>
+              </w:rPr>
+              <w:t>Docker Compose, Nginx</w:t>
+            </w:r>
+          </w:p>
+        </w:tc>
+        <w:tc>
+          <w:tcPr>
+            <w:tcW w:type="dxa" w:w="3860"/>
+            <w:vAlign w:val="center"/>
+            <w:tcMar>
+              <w:top w:w="100" w:type="dxa"/>
+              <w:start w:w="120" w:type="dxa"/>
+              <w:bottom w:w="100" w:type="dxa"/>
+              <w:end w:w="120" w:type="dxa"/>
+            </w:tcMar>
+          </w:tcPr>
+          <w:p>
+            <w:pPr>
+              <w:spacing w:before="0" w:after="0" w:line="276" w:lineRule="auto"/>
+              <w:ind w:firstLine="0"/>
+              <w:jc w:val="left"/>
+            </w:pPr>
+            <w:r>
+              <w:rPr>
+                <w:rFonts w:ascii="Times New Roman" w:hAnsi="Times New Roman" w:eastAsia="Times New Roman"/>
+                <w:b w:val="0"/>
+                <w:color w:val="000000"/>
+                <w:sz w:val="17"/>
+                <w:lang w:val="ru-RU"/>
+              </w:rPr>
+              <w:t>Использовал готовую среду, proxy и SPA fallback без изменений</w:t>
+            </w:r>
+          </w:p>
+        </w:tc>
+      </w:tr>
+      <w:tr>
+        <w:tc>
+          <w:tcPr>
+            <w:tcW w:type="dxa" w:w="1450"/>
+            <w:vAlign w:val="center"/>
+            <w:tcMar>
+              <w:top w:w="100" w:type="dxa"/>
+              <w:start w:w="120" w:type="dxa"/>
+              <w:bottom w:w="100" w:type="dxa"/>
+              <w:end w:w="120" w:type="dxa"/>
+            </w:tcMar>
+          </w:tcPr>
+          <w:p>
+            <w:pPr>
+              <w:spacing w:before="0" w:after="0" w:line="276" w:lineRule="auto"/>
+              <w:ind w:firstLine="0"/>
+              <w:jc w:val="left"/>
+            </w:pPr>
+            <w:r>
+              <w:rPr>
+                <w:rFonts w:ascii="Times New Roman" w:hAnsi="Times New Roman" w:eastAsia="Times New Roman"/>
+                <w:b w:val="0"/>
+                <w:color w:val="000000"/>
+                <w:sz w:val="17"/>
+                <w:lang w:val="ru-RU"/>
+              </w:rPr>
+              <w:t>Проверка</w:t>
+            </w:r>
+          </w:p>
+        </w:tc>
+        <w:tc>
+          <w:tcPr>
+            <w:tcW w:type="dxa" w:w="4050"/>
+            <w:vAlign w:val="center"/>
+            <w:tcMar>
+              <w:top w:w="100" w:type="dxa"/>
+              <w:start w:w="120" w:type="dxa"/>
+              <w:bottom w:w="100" w:type="dxa"/>
+              <w:end w:w="120" w:type="dxa"/>
+            </w:tcMar>
+          </w:tcPr>
+          <w:p>
+            <w:pPr>
+              <w:spacing w:before="0" w:after="0" w:line="276" w:lineRule="auto"/>
+              <w:ind w:firstLine="0"/>
+              <w:jc w:val="left"/>
+            </w:pPr>
+            <w:r>
+              <w:rPr>
+                <w:rFonts w:ascii="Times New Roman" w:hAnsi="Times New Roman" w:eastAsia="Times New Roman"/>
+                <w:b w:val="0"/>
+                <w:color w:val="000000"/>
+                <w:sz w:val="17"/>
+                <w:lang w:val="ru-RU"/>
+              </w:rPr>
+              <w:t>Node assert, Vitest 4, Testcontainers, Playwright smoke, ESLint 10</w:t>
+            </w:r>
+          </w:p>
+        </w:tc>
+        <w:tc>
+          <w:tcPr>
+            <w:tcW w:type="dxa" w:w="3860"/>
+            <w:vAlign w:val="center"/>
+            <w:tcMar>
+              <w:top w:w="100" w:type="dxa"/>
+              <w:start w:w="120" w:type="dxa"/>
+              <w:bottom w:w="100" w:type="dxa"/>
+              <w:end w:w="120" w:type="dxa"/>
+            </w:tcMar>
+          </w:tcPr>
+          <w:p>
+            <w:pPr>
+              <w:spacing w:before="0" w:after="0" w:line="276" w:lineRule="auto"/>
+              <w:ind w:firstLine="0"/>
+              <w:jc w:val="left"/>
+            </w:pPr>
+            <w:r>
+              <w:rPr>
+                <w:rFonts w:ascii="Times New Roman" w:hAnsi="Times New Roman" w:eastAsia="Times New Roman"/>
+                <w:b w:val="0"/>
+                <w:color w:val="000000"/>
+                <w:sz w:val="17"/>
+                <w:lang w:val="ru-RU"/>
+              </w:rPr>
+              <w:t>Проверил алгоритм, сборки, backend-регрессии и desktop/mobile UI</w:t>
             </w:r>
           </w:p>
         </w:tc>
@@ -1522,12 +1789,12 @@
     </w:p>
     <w:p>
       <w:r>
-        <w:t>Вычислительная логика вынесена из React-компонента в модуль candidate-match.ts. Такое разделение делает алгоритм независимым от интерфейса и позволяет тестировать его обычными входными объектами. Стек и роли разбираются по запятым, точкам с запятой и переводам строки. Значения переводятся в нижний регистр, символ «ё» заменяется на «е», пустые элементы и дубликаты исключаются с помощью Set [1].</w:t>
+        <w:t>Я вынес вычислительную логику из React-компонента в модуль candidate-match.ts. Благодаря этому алгоритм не зависит от интерфейса, и я тестирую его обычными входными объектами. Стек и роли я разбираю по запятым, точкам с запятой и переводам строки. Значения привожу к нижнему регистру, заменяю «ё» на «е», а пустые элементы и дубликаты исключаю с помощью Set [1].</w:t>
       </w:r>
     </w:p>
     <w:p>
       <w:r>
-        <w:t>Оценка стека Sstack равна доле требований проекта, совпавших с навыками кандидата. Оценка роли Srole равна 100, если найдено соответствие хотя бы одной конкретной роли, и 0 в противном случае. Общие слова developer, engineer, разработчик и специалист не используются как самостоятельное доказательство, если у роли есть конкретный маркер Frontend, QA или UX.</w:t>
+        <w:t>Оценку стека Sstack я считаю как долю требований проекта, совпавших с навыками кандидата. Оценка роли Srole равна 100 при соответствии хотя бы одной конкретной роли и 0 в противном случае. Общие слова developer, engineer, разработчик и специалист я не считаю самостоятельным доказательством, если у роли есть маркер Frontend, QA или UX.</w:t>
       </w:r>
     </w:p>
     <w:p>
@@ -1549,7 +1816,7 @@
     </w:p>
     <w:p>
       <w:r>
-        <w:t>Если заполнена только одна группа требований, её вес нормализуется до 100%. Результаты сортируются по убыванию процента, а при равенстве — по имени кандидата с русской локалью [2]. Исходные массивы не изменяются.</w:t>
+        <w:t>Если заполнена только одна группа требований, я нормализую её вес до 100%. Результаты сортирую по убыванию процента, а при равенстве — по имени кандидата с русской локалью [2]. Исходные массивы не изменяю.</w:t>
       </w:r>
     </w:p>
     <w:p>
@@ -1586,7 +1853,7 @@
     </w:p>
     <w:p>
       <w:r>
-        <w:t>Для демо-проекта со стеком React, TypeScript, Fastify, PostgreSQL профиль Алины покрывает две из четырёх технологий и соответствует роли Frontend developer. Итог составляет 0,6 × 50 + 0,4 × 100 = 70%. Профили Максима QA и Софии UX соответствуют ролям, но не покрывают технологии стека, поэтому получают по 40%.</w:t>
+        <w:t>На демо-проекте со стеком React, TypeScript, Fastify, PostgreSQL я получил ожидаемый результат: профиль Алины покрывает две из четырёх технологий и роль Frontend developer, поэтому набирает 70%. Максим QA и София UX совпадают только по ролям и получают по 40%.</w:t>
       </w:r>
     </w:p>
     <w:p>
@@ -1604,7 +1871,7 @@
     </w:p>
     <w:p>
       <w:r>
-        <w:t>Страница получает идентификатор проекта из URL. В useEffect [3] параллельно вызываются существующие методы getProject и searchUsers. Отмена эффекта защищает компонент от обновления состояния после размонтирования. Ошибки ApiClientError преобразуются в понятный баннер, а на время загрузки отображается существующий LoadingBlock.</w:t>
+        <w:t>На странице я получаю идентификатор проекта из URL. В useEffect [3] параллельно вызываю существующие методы getProject и searchUsers. Отменой эффекта защищаю компонент от обновления состояния после размонтирования. Ошибки ApiClientError показываю понятным баннером, а во время загрузки — существующим LoadingBlock.</w:t>
       </w:r>
     </w:p>
     <w:p>
@@ -1635,7 +1902,7 @@
     </w:p>
     <w:p>
       <w:r>
-        <w:t>Типизированные функции [4] rankCandidatesForProject и filterCandidateMatches вызываются как вычисления представления. React-компонент отвечает только за загрузку, состояние фильтров и разметку. Новый маршрут обёрнут в ProtectedRoute. Дополнительно исправлено сохранение вертикального scroll между SPA-маршрутами: каждый новый экран открывается с начала страницы.</w:t>
+        <w:t>Типизированные функции [4] rankCandidatesForProject и filterCandidateMatches я вызываю как вычисления представления. В React-компоненте оставляю загрузку, фильтры и разметку. Маршрут оборачиваю в ProtectedRoute. Также я исправил сохранение вертикального scroll между SPA-маршрутами: новый экран открывается с начала страницы.</w:t>
       </w:r>
     </w:p>
     <w:p>
@@ -1703,7 +1970,7 @@
     </w:p>
     <w:p>
       <w:r>
-        <w:t>Поле поиска фильтрует уже ранжированный список по имени, электронной почте, описанию и навыкам. Переключатель «Только с совпадениями» скрывает профили с нулевым результатом. Фильтрация не изменяет исходный массив и не вызывает дополнительных сетевых запросов. Если результат пуст, пользователь получает действие сброса фильтров.</w:t>
+        <w:t>Я реализовал поиск по имени, электронной почте, описанию и навыкам уже ранжированного списка. Переключателем «Только с совпадениями» скрываю нулевые результаты. Фильтрация не изменяет исходный массив и не вызывает новых сетевых запросов; при пустом результате я показываю сброс фильтров.</w:t>
       </w:r>
     </w:p>
     <w:p>
@@ -1758,7 +2025,7 @@
     </w:p>
     <w:p>
       <w:r>
-        <w:t>На ширине 390 пикселей карточка перестраивается в одну колонку, процент и объяснения остаются читаемыми, а элементы управления сохраняют удобную область нажатия. В browser smoke ширина документа и viewport совпали: 390 пикселей, горизонтальное переполнение отсутствует.</w:t>
+        <w:t>Для ширины 390 пикселей я перестроил карточку в одну колонку и сохранил читаемость оценки и объяснений. В browser smoke я подтвердил: ширина документа и viewport равна 390 пикселям, горизонтального переполнения нет.</w:t>
       </w:r>
     </w:p>
     <w:p>
@@ -1826,12 +2093,12 @@
     </w:p>
     <w:p>
       <w:r>
-        <w:t>В результате очередной итерации проекта Teamnova, который команда ChamBucket продолжает после проектного практикума, появился новый законченный пользовательский сценарий. Владелец проекта может перейти из рабочей области на отдельный экран, увидеть три демо-профиля в ожидаемом порядке, понять основания оценки, выполнить поиск и открыть почтовый клиент с темой выбранного проекта. Сценарий работает поверх текущего API и не нарушает существующий цикл заявок.</w:t>
+        <w:t>В очередной итерации Teamnova, которую команда «Чамбакет» продолжает после проектного практикума, я реализовал законченный frontend-сценарий. Владелец переходит на отдельный экран, видит три профиля в ожидаемом порядке, понимает оценку, выполняет поиск и открывает email-контакт. Я использовал текущий API и не менял цикл заявок.</w:t>
       </w:r>
     </w:p>
     <w:p>
       <w:r>
-        <w:t>Разработка выполнялась по схеме test-driven development. Сначала были добавлены проверки ожидаемых процентов, нормализации, сортировки и отсутствия мутаций. До реализации тесты завершались ошибкой, после добавления модуля — успешно. Отдельным регрессионным тестом закреплён сброс scroll при смене маршрута.</w:t>
+        <w:t>Я выполнял разработку по test-driven development: сначала добавил проверки процентов, нормализации, сортировки и отсутствия мутаций, затем реализовал модуль. Отдельным регрессионным тестом я закрепил сброс scroll при смене маршрута.</w:t>
       </w:r>
     </w:p>
     <w:p>
@@ -2576,7 +2843,7 @@
     </w:tbl>
     <w:p>
       <w:r>
-        <w:t>Все 81 backend-тест прошли, включая интеграционные сценарии. Серверный код при этом не изменялся. Цель итерации достигнута: поиск команды стал проактивным и объяснимым без архитектурного расширения MVP.</w:t>
+        <w:t>Я подтвердил отсутствие регрессий: прошли все 81 backend-тест, хотя серверный код я не менял. Цель моей итерации достигнута: поиск команды стал проактивным и объяснимым без архитектурного расширения MVP.</w:t>
       </w:r>
     </w:p>
     <w:p>
@@ -2739,7 +3006,7 @@
           <w:sz w:val="28"/>
           <w:lang w:val="ru-RU"/>
         </w:rPr>
-        <w:t>. Код и документация проекта Дата обращения: 10.07.2026.</w:t>
+        <w:t>. Код, package.json и документация проекта Дата обращения: 10.07.2026.</w:t>
       </w:r>
     </w:p>
     <w:p>
@@ -2752,7 +3019,7 @@
     </w:p>
     <w:p>
       <w:r>
-        <w:t>Генеративный ИИ использовался как инструмент разработки и оформления. Его участие не скрывается и не подменяет фактическую проверку результата. С помощью ИИ были подготовлены:</w:t>
+        <w:t>При подготовке работы я использовал генеративный ИИ как инструмент разработки и оформления. Я не скрываю его участие и отделяю ИИ-материалы от своей постановки задачи и проверки результата. С помощью ИИ я подготовил:</w:t>
       </w:r>
     </w:p>
     <w:p>
@@ -2765,7 +3032,7 @@
         <w:ind w:firstLine="0" w:left="709"/>
       </w:pPr>
       <w:r>
-        <w:t>первичная версия candidate-match.ts и candidateMatch.test.ts;</w:t>
+        <w:t>первичную версию candidate-match.ts и candidateMatch.test.ts;</w:t>
       </w:r>
     </w:p>
     <w:p>
@@ -2778,7 +3045,7 @@
         <w:ind w:firstLine="0" w:left="709"/>
       </w:pPr>
       <w:r>
-        <w:t>разметка CandidateMatchingPage.tsx и CSS-правила;</w:t>
+        <w:t>разметку CandidateMatchingPage.tsx и CSS-правила;</w:t>
       </w:r>
     </w:p>
     <w:p>
@@ -2791,7 +3058,7 @@
         <w:ind w:firstLine="0" w:left="709"/>
       </w:pPr>
       <w:r>
-        <w:t>структура отчёта, формулировки и подписи;</w:t>
+        <w:t>структуру отчёта, формулировки и подписи;</w:t>
       </w:r>
     </w:p>
     <w:p>
@@ -2809,7 +3076,7 @@
     </w:p>
     <w:p>
       <w:r>
-        <w:t>Четыре скриншота получены из реально запущенного приложения и не являются сгенерированными изображениями. Код проверен типизацией, тестами и browser smoke; документ — постраничным рендером DOCX в PNG. Итог отражает индивидуальную frontend-зону: маршрут, интерфейс, типизированный алгоритм, адаптивность и тестирование.</w:t>
+        <w:t>Самостоятельно я определил цель frontend-итерации, описал AS IS и TO BE, сохранил границы API и уточнил состав команды. Первичные ИИ-материалы были доработаны и проверены типизацией, тестами и browser smoke. Четыре скриншота я использую как артефакты реально запущенного приложения; они не сгенерированы ИИ. DOCX проверен постраничным PNG-рендером.</w:t>
       </w:r>
     </w:p>
     <w:sectPr>

</xml_diff>

<commit_message>
docs(practice): align report with reference template
</commit_message>
<xml_diff>
--- a/docs/practice-report/teamnova-summer-practice-report.docx
+++ b/docs/practice-report/teamnova-summer-practice-report.docx
@@ -6,17 +6,15 @@
     <w:p/>
     <w:p>
       <w:pPr>
-        <w:spacing w:after="440"/>
+        <w:spacing w:after="400" w:line="360" w:lineRule="auto"/>
         <w:ind w:firstLine="0"/>
         <w:jc w:val="center"/>
       </w:pPr>
       <w:r>
         <w:rPr>
-          <w:rFonts w:ascii="Times New Roman" w:hAnsi="Times New Roman" w:eastAsia="Times New Roman"/>
+          <w:rFonts w:ascii="Times New Roman" w:hAnsi="Times New Roman"/>
           <w:b/>
-          <w:color w:val="000000"/>
-          <w:sz w:val="24"/>
-          <w:lang w:val="ru-RU"/>
+          <w:sz w:val="26"/>
         </w:rPr>
         <w:t>ФЕДЕРАЛЬНОЕ ГОСУДАРСТВЕННОЕ АВТОНОМНОЕ</w:t>
         <w:br/>
@@ -27,21 +25,45 @@
         <w:t>ИМЕНИ ПЕРВОГО ПРЕЗИДЕНТА РОССИИ Б. Н. ЕЛЬЦИНА»</w:t>
       </w:r>
     </w:p>
-    <w:p/>
-    <w:p/>
     <w:p>
       <w:pPr>
-        <w:spacing w:after="240"/>
+        <w:spacing w:after="0" w:line="360" w:lineRule="auto"/>
+        <w:jc w:val="left"/>
+      </w:pPr>
+      <w:r>
+        <w:rPr>
+          <w:rFonts w:ascii="Times New Roman" w:hAnsi="Times New Roman"/>
+          <w:b w:val="0"/>
+          <w:sz w:val="28"/>
+        </w:rPr>
+        <w:t>Оценка работы ____________</w:t>
+      </w:r>
+    </w:p>
+    <w:p>
+      <w:pPr>
+        <w:spacing w:after="480" w:line="360" w:lineRule="auto"/>
+        <w:jc w:val="left"/>
+      </w:pPr>
+      <w:r>
+        <w:rPr>
+          <w:rFonts w:ascii="Times New Roman" w:hAnsi="Times New Roman"/>
+          <w:b w:val="0"/>
+          <w:sz w:val="28"/>
+        </w:rPr>
+        <w:t>Руководитель практики __________</w:t>
+      </w:r>
+    </w:p>
+    <w:p>
+      <w:pPr>
+        <w:spacing w:after="280" w:line="276" w:lineRule="auto"/>
         <w:ind w:firstLine="0"/>
         <w:jc w:val="center"/>
       </w:pPr>
       <w:r>
         <w:rPr>
-          <w:rFonts w:ascii="Times New Roman" w:hAnsi="Times New Roman" w:eastAsia="Times New Roman"/>
+          <w:rFonts w:ascii="Times New Roman" w:hAnsi="Times New Roman"/>
           <w:b/>
-          <w:color w:val="000000"/>
           <w:sz w:val="32"/>
-          <w:lang w:val="ru-RU"/>
         </w:rPr>
         <w:t>ОТЧЁТ</w:t>
         <w:br/>
@@ -50,17 +72,15 @@
     </w:p>
     <w:p>
       <w:pPr>
-        <w:spacing w:after="560"/>
+        <w:spacing w:after="560" w:line="360" w:lineRule="auto"/>
         <w:ind w:firstLine="0"/>
         <w:jc w:val="center"/>
       </w:pPr>
       <w:r>
         <w:rPr>
-          <w:rFonts w:ascii="Times New Roman" w:hAnsi="Times New Roman" w:eastAsia="Times New Roman"/>
+          <w:rFonts w:ascii="Times New Roman" w:hAnsi="Times New Roman"/>
           <w:b/>
-          <w:color w:val="000000"/>
           <w:sz w:val="28"/>
-          <w:lang w:val="ru-RU"/>
         </w:rPr>
         <w:t>Разработка функции подбора участников</w:t>
         <w:br/>
@@ -72,15 +92,14 @@
     <w:p>
       <w:pPr>
         <w:spacing w:line="360" w:lineRule="auto"/>
-        <w:ind w:left="4819" w:firstLine="0"/>
+        <w:ind w:left="4820" w:firstLine="0"/>
         <w:jc w:val="left"/>
       </w:pPr>
       <w:r>
         <w:rPr>
-          <w:rFonts w:ascii="Times New Roman" w:hAnsi="Times New Roman" w:eastAsia="Times New Roman"/>
-          <w:color w:val="000000"/>
+          <w:rFonts w:ascii="Times New Roman" w:hAnsi="Times New Roman"/>
+          <w:b w:val="0"/>
           <w:sz w:val="28"/>
-          <w:lang w:val="ru-RU"/>
         </w:rPr>
         <w:t>Выполнил:</w:t>
         <w:br/>
@@ -93,22 +112,47 @@
         <w:t>Мусиенко Матвей Валерьевич</w:t>
       </w:r>
     </w:p>
-    <w:p/>
-    <w:p/>
+    <w:p>
+      <w:pPr>
+        <w:spacing w:line="360" w:lineRule="auto"/>
+        <w:jc w:val="left"/>
+      </w:pPr>
+      <w:r>
+        <w:rPr>
+          <w:rFonts w:ascii="Times New Roman" w:hAnsi="Times New Roman"/>
+          <w:b w:val="0"/>
+          <w:sz w:val="26"/>
+        </w:rPr>
+        <w:t>Специальность (направление подготовки) 09.03.03 Прикладная информатика</w:t>
+      </w:r>
+    </w:p>
+    <w:p>
+      <w:pPr>
+        <w:spacing w:after="900" w:line="360" w:lineRule="auto"/>
+        <w:jc w:val="left"/>
+      </w:pPr>
+      <w:r>
+        <w:rPr>
+          <w:rFonts w:ascii="Times New Roman" w:hAnsi="Times New Roman"/>
+          <w:b w:val="0"/>
+          <w:sz w:val="26"/>
+        </w:rPr>
+        <w:t>Группа РИ-150922</w:t>
+      </w:r>
+    </w:p>
     <w:p/>
     <w:p/>
     <w:p>
       <w:pPr>
-        <w:spacing w:after="0"/>
+        <w:spacing w:after="0" w:line="360" w:lineRule="auto"/>
         <w:ind w:firstLine="0"/>
         <w:jc w:val="center"/>
       </w:pPr>
       <w:r>
         <w:rPr>
-          <w:rFonts w:ascii="Times New Roman" w:hAnsi="Times New Roman" w:eastAsia="Times New Roman"/>
-          <w:color w:val="000000"/>
+          <w:rFonts w:ascii="Times New Roman" w:hAnsi="Times New Roman"/>
+          <w:b w:val="0"/>
           <w:sz w:val="28"/>
-          <w:lang w:val="ru-RU"/>
         </w:rPr>
         <w:t>Екатеринбург</w:t>
         <w:br/>
@@ -118,6 +162,7 @@
     <w:p>
       <w:pPr>
         <w:sectPr>
+          <w:headerReference w:type="default" r:id="rId20"/>
           <w:pgSz w:w="11906" w:h="16838"/>
           <w:pgMar w:top="1134" w:right="850" w:bottom="1134" w:left="1701" w:header="0" w:footer="0" w:gutter="0"/>
           <w:cols w:space="720"/>
@@ -128,9 +173,16 @@
     <w:p>
       <w:pPr>
         <w:pStyle w:val="Heading1"/>
+        <w:spacing w:after="360" w:line="360" w:lineRule="auto"/>
+        <w:jc w:val="left"/>
       </w:pPr>
       <w:r>
-        <w:t>СОДЕРЖАНИЕ</w:t>
+        <w:rPr>
+          <w:rFonts w:ascii="Times New Roman" w:hAnsi="Times New Roman"/>
+          <w:b/>
+          <w:sz w:val="32"/>
+        </w:rPr>
+        <w:t>Оглавление</w:t>
       </w:r>
     </w:p>
     <w:p>
@@ -3122,15 +3174,18 @@
       <w:spacing w:after="0"/>
       <w:jc w:val="right"/>
     </w:pPr>
-    <w:r>
-      <w:rPr>
-        <w:rFonts w:ascii="Times New Roman" w:hAnsi="Times New Roman" w:eastAsia="Times New Roman"/>
-        <w:color w:val="595959"/>
-        <w:sz w:val="18"/>
-        <w:lang w:val="ru-RU"/>
-      </w:rPr>
-      <w:t>ОТЧЁТ ПО ЛЕТНЕЙ ПРОЕКТНОЙ ПРАКТИКЕ · TEAMNOVA</w:t>
-    </w:r>
+    <w:r/>
+  </w:p>
+</w:hdr>
+</file>
+
+<file path=word/header2.xml><?xml version="1.0" encoding="utf-8"?>
+<w:hdr xmlns:m="http://schemas.openxmlformats.org/officeDocument/2006/math" xmlns:mc="http://schemas.openxmlformats.org/markup-compatibility/2006" xmlns:mo="http://schemas.microsoft.com/office/mac/office/2008/main" xmlns:mv="urn:schemas-microsoft-com:mac:vml" xmlns:o="urn:schemas-microsoft-com:office:office" xmlns:r="http://schemas.openxmlformats.org/officeDocument/2006/relationships" xmlns:v="urn:schemas-microsoft-com:vml" xmlns:w10="urn:schemas-microsoft-com:office:word" xmlns:w14="http://schemas.microsoft.com/office/word/2010/wordml" xmlns:w="http://schemas.openxmlformats.org/wordprocessingml/2006/main" xmlns:wne="http://schemas.microsoft.com/office/word/2006/wordml" xmlns:wp14="http://schemas.microsoft.com/office/word/2010/wordprocessingDrawing" xmlns:wp="http://schemas.openxmlformats.org/drawingml/2006/wordprocessingDrawing" xmlns:wpc="http://schemas.microsoft.com/office/word/2010/wordprocessingCanvas" xmlns:wpg="http://schemas.microsoft.com/office/word/2010/wordprocessingGroup" xmlns:wpi="http://schemas.microsoft.com/office/word/2010/wordprocessingInk" xmlns:wps="http://schemas.microsoft.com/office/word/2010/wordprocessingShape" mc:Ignorable="w14 wp14">
+  <w:p>
+    <w:pPr>
+      <w:pStyle w:val="Header"/>
+    </w:pPr>
+    <w:r/>
   </w:p>
 </w:hdr>
 </file>

</xml_diff>